<commit_message>
feat: upgrade to multi-tenant SaaS architecture with dark-mode UI and RBAC
</commit_message>
<xml_diff>
--- a/synopsis template.docx
+++ b/synopsis template.docx
@@ -22,7 +22,6 @@
         <w:jc w:val="center"/>
       </w:pPr>
       <w:proofErr w:type="spellStart"/>
-      <w:proofErr w:type="gramStart"/>
       <w:r>
         <w:rPr>
           <w:rFonts w:ascii="Times New Roman" w:eastAsia="Times New Roman" w:hAnsi="Times New Roman" w:cs="Times New Roman"/>
@@ -32,7 +31,6 @@
         <w:t>B.Tech</w:t>
       </w:r>
       <w:proofErr w:type="spellEnd"/>
-      <w:proofErr w:type="gramEnd"/>
       <w:r>
         <w:rPr>
           <w:rFonts w:ascii="Times New Roman" w:eastAsia="Times New Roman" w:hAnsi="Times New Roman" w:cs="Times New Roman"/>
@@ -344,32 +342,19 @@
         <w:rPr>
           <w:sz w:val="32"/>
         </w:rPr>
-        <w:t xml:space="preserve">Ananya </w:t>
-      </w:r>
-      <w:proofErr w:type="gramStart"/>
+        <w:t>Ananya Awasthi</w:t>
+      </w:r>
       <w:r>
         <w:rPr>
           <w:sz w:val="32"/>
         </w:rPr>
-        <w:t>Awasthi</w:t>
+        <w:t xml:space="preserve">  </w:t>
       </w:r>
       <w:r>
         <w:rPr>
           <w:sz w:val="32"/>
         </w:rPr>
-        <w:t xml:space="preserve">  </w:t>
-      </w:r>
-      <w:r>
-        <w:rPr>
-          <w:sz w:val="32"/>
-        </w:rPr>
         <w:tab/>
-      </w:r>
-      <w:proofErr w:type="gramEnd"/>
-      <w:r>
-        <w:rPr>
-          <w:sz w:val="32"/>
-        </w:rPr>
         <w:t xml:space="preserve">     UR: 2</w:t>
       </w:r>
       <w:r>
@@ -490,21 +475,12 @@
         </w:tabs>
         <w:spacing w:after="0"/>
       </w:pPr>
-      <w:proofErr w:type="gramStart"/>
       <w:r>
         <w:rPr>
           <w:b/>
           <w:sz w:val="32"/>
         </w:rPr>
-        <w:t>Signature :</w:t>
-      </w:r>
-      <w:proofErr w:type="gramEnd"/>
-      <w:r>
-        <w:rPr>
-          <w:b/>
-          <w:sz w:val="32"/>
-        </w:rPr>
-        <w:t xml:space="preserve">  </w:t>
+        <w:t xml:space="preserve">Signature :  </w:t>
       </w:r>
       <w:r>
         <w:rPr>
@@ -543,7 +519,23 @@
           <w:b/>
           <w:sz w:val="36"/>
         </w:rPr>
-        <w:t xml:space="preserve"> Project Synopsis:</w:t>
+        <w:t xml:space="preserve"> Project </w:t>
+      </w:r>
+      <w:r>
+        <w:rPr>
+          <w:rFonts w:ascii="Times New Roman" w:eastAsia="Times New Roman" w:hAnsi="Times New Roman" w:cs="Times New Roman"/>
+          <w:b/>
+          <w:sz w:val="36"/>
+        </w:rPr>
+        <w:t>Title</w:t>
+      </w:r>
+      <w:r>
+        <w:rPr>
+          <w:rFonts w:ascii="Times New Roman" w:eastAsia="Times New Roman" w:hAnsi="Times New Roman" w:cs="Times New Roman"/>
+          <w:b/>
+          <w:sz w:val="36"/>
+        </w:rPr>
+        <w:t>:</w:t>
       </w:r>
       <w:r>
         <w:rPr>
@@ -695,31 +687,14 @@
           <w:b/>
           <w:sz w:val="28"/>
         </w:rPr>
-        <w:t>Team name &amp; ID</w:t>
-      </w:r>
-      <w:proofErr w:type="gramStart"/>
+        <w:t>Team name &amp; ID:</w:t>
+      </w:r>
       <w:r>
         <w:rPr>
           <w:rFonts w:ascii="Times New Roman" w:eastAsia="Times New Roman" w:hAnsi="Times New Roman" w:cs="Times New Roman"/>
-          <w:b/>
-          <w:sz w:val="28"/>
-        </w:rPr>
-        <w:t>:</w:t>
-      </w:r>
-      <w:r>
-        <w:rPr>
-          <w:rFonts w:ascii="Times New Roman" w:eastAsia="Times New Roman" w:hAnsi="Times New Roman" w:cs="Times New Roman"/>
-          <w:sz w:val="28"/>
-        </w:rPr>
-        <w:t xml:space="preserve">  (</w:t>
-      </w:r>
-      <w:proofErr w:type="gramEnd"/>
-      <w:r>
-        <w:rPr>
-          <w:rFonts w:ascii="Times New Roman" w:eastAsia="Times New Roman" w:hAnsi="Times New Roman" w:cs="Times New Roman"/>
-          <w:sz w:val="28"/>
-        </w:rPr>
-        <w:t>T-</w:t>
+          <w:sz w:val="28"/>
+        </w:rPr>
+        <w:t xml:space="preserve">  (T-</w:t>
       </w:r>
       <w:r>
         <w:rPr>
@@ -1391,7 +1366,7 @@
               </wp:inline>
             </w:drawing>
           </mc:Choice>
-          <mc:Fallback xmlns:a="http://schemas.openxmlformats.org/drawingml/2006/main" xmlns:w16cei="http://schemas.microsoft.com/office/word/2026/wordml/cei">
+          <mc:Fallback xmlns:w16cei="http://schemas.microsoft.com/office/word/2026/wordml/cei" xmlns:a="http://schemas.openxmlformats.org/drawingml/2006/main">
             <w:pict>
               <v:group id="Group 28939" style="width:468.1pt;height:1.51001pt;mso-position-horizontal-relative:char;mso-position-vertical-relative:line" coordsize="59448,191">
                 <v:shape id="Shape 40836" style="position:absolute;width:59436;height:184;left:0;top:0;" coordsize="5943600,18415" path="m0,0l5943600,0l5943600,18415l0,18415l0,0">
@@ -1498,7 +1473,6 @@
         </w:rPr>
       </w:pPr>
       <w:proofErr w:type="spellStart"/>
-      <w:proofErr w:type="gramStart"/>
       <w:r>
         <w:rPr>
           <w:rFonts w:ascii="Times New Roman" w:eastAsia="Times New Roman" w:hAnsi="Times New Roman" w:cs="Times New Roman"/>
@@ -1525,7 +1499,6 @@
         <w:t>Build</w:t>
       </w:r>
       <w:proofErr w:type="spellEnd"/>
-      <w:proofErr w:type="gramEnd"/>
       <w:r>
         <w:rPr>
           <w:rFonts w:ascii="Times New Roman" w:eastAsia="Times New Roman" w:hAnsi="Times New Roman" w:cs="Times New Roman"/>
@@ -3801,7 +3774,7 @@
               </wp:inline>
             </w:drawing>
           </mc:Choice>
-          <mc:Fallback xmlns:a="http://schemas.openxmlformats.org/drawingml/2006/main" xmlns:w16cei="http://schemas.microsoft.com/office/word/2026/wordml/cei">
+          <mc:Fallback xmlns:w16cei="http://schemas.microsoft.com/office/word/2026/wordml/cei" xmlns:a="http://schemas.openxmlformats.org/drawingml/2006/main">
             <w:pict>
               <v:group id="Group 31117" style="width:468.1pt;height:1.53003pt;mso-position-horizontal-relative:char;mso-position-vertical-relative:line" coordsize="59448,194">
                 <v:shape id="Shape 40872" style="position:absolute;width:59436;height:184;left:0;top:0;" coordsize="5943600,18415" path="m0,0l5943600,0l5943600,18415l0,18415l0,0">
@@ -5152,7 +5125,7 @@
               </wp:inline>
             </w:drawing>
           </mc:Choice>
-          <mc:Fallback xmlns:a="http://schemas.openxmlformats.org/drawingml/2006/main" xmlns:w16cei="http://schemas.microsoft.com/office/word/2026/wordml/cei">
+          <mc:Fallback xmlns:w16cei="http://schemas.microsoft.com/office/word/2026/wordml/cei" xmlns:a="http://schemas.openxmlformats.org/drawingml/2006/main">
             <w:pict>
               <v:group id="Group 38200" style="width:468.1pt;height:1.47pt;mso-position-horizontal-relative:char;mso-position-vertical-relative:line" coordsize="59448,186">
                 <v:shape id="Shape 40890" style="position:absolute;width:59436;height:177;left:0;top:0;" coordsize="5943600,17780" path="m0,0l5943600,0l5943600,17780l0,17780l0,0">
@@ -5662,7 +5635,6 @@
               <w:jc w:val="both"/>
             </w:pPr>
             <w:proofErr w:type="spellStart"/>
-            <w:proofErr w:type="gramStart"/>
             <w:r>
               <w:rPr>
                 <w:rFonts w:ascii="Times New Roman" w:eastAsia="Times New Roman" w:hAnsi="Times New Roman" w:cs="Times New Roman"/>
@@ -5677,7 +5649,6 @@
               <w:t>WebSo</w:t>
             </w:r>
             <w:proofErr w:type="spellEnd"/>
-            <w:proofErr w:type="gramEnd"/>
           </w:p>
           <w:p>
             <w:proofErr w:type="spellStart"/>
@@ -6691,7 +6662,7 @@
               </wp:inline>
             </w:drawing>
           </mc:Choice>
-          <mc:Fallback xmlns:a="http://schemas.openxmlformats.org/drawingml/2006/main" xmlns:w16cei="http://schemas.microsoft.com/office/word/2026/wordml/cei">
+          <mc:Fallback xmlns:w16cei="http://schemas.microsoft.com/office/word/2026/wordml/cei" xmlns:a="http://schemas.openxmlformats.org/drawingml/2006/main">
             <w:pict>
               <v:group id="Group 38953" style="width:468.1pt;height:1.45001pt;mso-position-horizontal-relative:char;mso-position-vertical-relative:line" coordsize="59448,184">
                 <v:shape id="Shape 40908" style="position:absolute;width:59436;height:184;left:0;top:0;" coordsize="5943600,18415" path="m0,0l5943600,0l5943600,18415l0,18415l0,0">
@@ -6921,21 +6892,12 @@
             <w:pPr>
               <w:ind w:left="14"/>
             </w:pPr>
-            <w:proofErr w:type="gramStart"/>
-            <w:r>
-              <w:rPr>
-                <w:rFonts w:ascii="Times New Roman" w:eastAsia="Times New Roman" w:hAnsi="Times New Roman" w:cs="Times New Roman"/>
-                <w:sz w:val="28"/>
-              </w:rPr>
-              <w:t>Akshya( Lead</w:t>
-            </w:r>
-            <w:proofErr w:type="gramEnd"/>
-            <w:r>
-              <w:rPr>
-                <w:rFonts w:ascii="Times New Roman" w:eastAsia="Times New Roman" w:hAnsi="Times New Roman" w:cs="Times New Roman"/>
-                <w:sz w:val="28"/>
-              </w:rPr>
-              <w:t xml:space="preserve">) </w:t>
+            <w:r>
+              <w:rPr>
+                <w:rFonts w:ascii="Times New Roman" w:eastAsia="Times New Roman" w:hAnsi="Times New Roman" w:cs="Times New Roman"/>
+                <w:sz w:val="28"/>
+              </w:rPr>
+              <w:t xml:space="preserve">Akshya( Lead) </w:t>
             </w:r>
           </w:p>
         </w:tc>
@@ -6953,21 +6915,12 @@
             <w:pPr>
               <w:ind w:left="14"/>
             </w:pPr>
-            <w:proofErr w:type="gramStart"/>
-            <w:r>
-              <w:rPr>
-                <w:rFonts w:ascii="Times New Roman" w:eastAsia="Times New Roman" w:hAnsi="Times New Roman" w:cs="Times New Roman"/>
-                <w:sz w:val="28"/>
-              </w:rPr>
-              <w:t>Akshya( Backend</w:t>
-            </w:r>
-            <w:proofErr w:type="gramEnd"/>
-            <w:r>
-              <w:rPr>
-                <w:rFonts w:ascii="Times New Roman" w:eastAsia="Times New Roman" w:hAnsi="Times New Roman" w:cs="Times New Roman"/>
-                <w:sz w:val="28"/>
-              </w:rPr>
-              <w:t xml:space="preserve">) </w:t>
+            <w:r>
+              <w:rPr>
+                <w:rFonts w:ascii="Times New Roman" w:eastAsia="Times New Roman" w:hAnsi="Times New Roman" w:cs="Times New Roman"/>
+                <w:sz w:val="28"/>
+              </w:rPr>
+              <w:t xml:space="preserve">Akshya( Backend) </w:t>
             </w:r>
           </w:p>
         </w:tc>
@@ -6985,21 +6938,12 @@
             <w:pPr>
               <w:ind w:left="14"/>
             </w:pPr>
-            <w:proofErr w:type="gramStart"/>
-            <w:r>
-              <w:rPr>
-                <w:rFonts w:ascii="Times New Roman" w:eastAsia="Times New Roman" w:hAnsi="Times New Roman" w:cs="Times New Roman"/>
-                <w:sz w:val="28"/>
-              </w:rPr>
-              <w:t>Manish(</w:t>
-            </w:r>
-            <w:proofErr w:type="gramEnd"/>
-            <w:r>
-              <w:rPr>
-                <w:rFonts w:ascii="Times New Roman" w:eastAsia="Times New Roman" w:hAnsi="Times New Roman" w:cs="Times New Roman"/>
-                <w:sz w:val="28"/>
-              </w:rPr>
-              <w:t xml:space="preserve">F </w:t>
+            <w:r>
+              <w:rPr>
+                <w:rFonts w:ascii="Times New Roman" w:eastAsia="Times New Roman" w:hAnsi="Times New Roman" w:cs="Times New Roman"/>
+                <w:sz w:val="28"/>
+              </w:rPr>
+              <w:t xml:space="preserve">Manish(F </w:t>
             </w:r>
             <w:proofErr w:type="spellStart"/>
             <w:r>
@@ -7033,21 +6977,12 @@
             <w:pPr>
               <w:ind w:left="17"/>
             </w:pPr>
-            <w:proofErr w:type="gramStart"/>
-            <w:r>
-              <w:rPr>
-                <w:rFonts w:ascii="Times New Roman" w:eastAsia="Times New Roman" w:hAnsi="Times New Roman" w:cs="Times New Roman"/>
-                <w:sz w:val="28"/>
-              </w:rPr>
-              <w:t>Divya(</w:t>
-            </w:r>
-            <w:proofErr w:type="gramEnd"/>
-            <w:r>
-              <w:rPr>
-                <w:rFonts w:ascii="Times New Roman" w:eastAsia="Times New Roman" w:hAnsi="Times New Roman" w:cs="Times New Roman"/>
-                <w:sz w:val="28"/>
-              </w:rPr>
-              <w:t xml:space="preserve">QA/ Docs) </w:t>
+            <w:r>
+              <w:rPr>
+                <w:rFonts w:ascii="Times New Roman" w:eastAsia="Times New Roman" w:hAnsi="Times New Roman" w:cs="Times New Roman"/>
+                <w:sz w:val="28"/>
+              </w:rPr>
+              <w:t xml:space="preserve">Divya(QA/ Docs) </w:t>
             </w:r>
           </w:p>
         </w:tc>
@@ -9741,7 +9676,7 @@
               </wp:inline>
             </w:drawing>
           </mc:Choice>
-          <mc:Fallback xmlns:a="http://schemas.openxmlformats.org/drawingml/2006/main" xmlns:w16cei="http://schemas.microsoft.com/office/word/2026/wordml/cei">
+          <mc:Fallback xmlns:w16cei="http://schemas.microsoft.com/office/word/2026/wordml/cei" xmlns:a="http://schemas.openxmlformats.org/drawingml/2006/main">
             <w:pict>
               <v:group id="Group 32071" style="width:468.1pt;height:1.48004pt;mso-position-horizontal-relative:char;mso-position-vertical-relative:line" coordsize="59448,187">
                 <v:shape id="Shape 40926" style="position:absolute;width:59436;height:184;left:0;top:0;" coordsize="5943600,18415" path="m0,0l5943600,0l5943600,18415l0,18415l0,0">
@@ -11828,7 +11763,7 @@
               </wp:inline>
             </w:drawing>
           </mc:Choice>
-          <mc:Fallback xmlns:a="http://schemas.openxmlformats.org/drawingml/2006/main" xmlns:w16cei="http://schemas.microsoft.com/office/word/2026/wordml/cei">
+          <mc:Fallback xmlns:w16cei="http://schemas.microsoft.com/office/word/2026/wordml/cei" xmlns:a="http://schemas.openxmlformats.org/drawingml/2006/main">
             <w:pict>
               <v:group id="Group 29107" style="width:468.1pt;height:1.51001pt;mso-position-horizontal-relative:char;mso-position-vertical-relative:line" coordsize="59448,191">
                 <v:shape id="Shape 40944" style="position:absolute;width:59436;height:184;left:0;top:0;" coordsize="5943600,18415" path="m0,0l5943600,0l5943600,18415l0,18415l0,0">
@@ -12539,7 +12474,7 @@
               </wp:inline>
             </w:drawing>
           </mc:Choice>
-          <mc:Fallback xmlns:a="http://schemas.openxmlformats.org/drawingml/2006/main" xmlns:w16cei="http://schemas.microsoft.com/office/word/2026/wordml/cei">
+          <mc:Fallback xmlns:w16cei="http://schemas.microsoft.com/office/word/2026/wordml/cei" xmlns:a="http://schemas.openxmlformats.org/drawingml/2006/main">
             <w:pict>
               <v:group id="Group 29108" style="width:468.1pt;height:1.52997pt;mso-position-horizontal-relative:char;mso-position-vertical-relative:line" coordsize="59448,194">
                 <v:shape id="Shape 40962" style="position:absolute;width:59436;height:184;left:0;top:0;" coordsize="5943600,18414" path="m0,0l5943600,0l5943600,18414l0,18414l0,0">
@@ -14367,7 +14302,7 @@
               </wp:inline>
             </w:drawing>
           </mc:Choice>
-          <mc:Fallback xmlns:a="http://schemas.openxmlformats.org/drawingml/2006/main" xmlns:w16cei="http://schemas.microsoft.com/office/word/2026/wordml/cei">
+          <mc:Fallback xmlns:w16cei="http://schemas.microsoft.com/office/word/2026/wordml/cei" xmlns:a="http://schemas.openxmlformats.org/drawingml/2006/main">
             <w:pict>
               <v:group id="Group 33184" style="width:468.1pt;height:1.51001pt;mso-position-horizontal-relative:char;mso-position-vertical-relative:line" coordsize="59448,191">
                 <v:shape id="Shape 40980" style="position:absolute;width:59436;height:184;left:0;top:0;" coordsize="5943600,18415" path="m0,0l5943600,0l5943600,18415l0,18415l0,0">
@@ -16122,23 +16057,7 @@
                 <w:rFonts w:ascii="Times New Roman" w:eastAsia="Times New Roman" w:hAnsi="Times New Roman" w:cs="Times New Roman"/>
                 <w:sz w:val="28"/>
               </w:rPr>
-              <w:t>200 {</w:t>
-            </w:r>
-            <w:proofErr w:type="gramStart"/>
-            <w:r>
-              <w:rPr>
-                <w:rFonts w:ascii="Times New Roman" w:eastAsia="Times New Roman" w:hAnsi="Times New Roman" w:cs="Times New Roman"/>
-                <w:sz w:val="28"/>
-              </w:rPr>
-              <w:t>items[</w:t>
-            </w:r>
-            <w:proofErr w:type="gramEnd"/>
-            <w:r>
-              <w:rPr>
-                <w:rFonts w:ascii="Times New Roman" w:eastAsia="Times New Roman" w:hAnsi="Times New Roman" w:cs="Times New Roman"/>
-                <w:sz w:val="28"/>
-              </w:rPr>
-              <w:t xml:space="preserve">], total} </w:t>
+              <w:t xml:space="preserve">200 {items[], total} </w:t>
             </w:r>
           </w:p>
         </w:tc>
@@ -16276,40 +16195,22 @@
           <w:szCs w:val="28"/>
         </w:rPr>
       </w:pPr>
-      <w:proofErr w:type="gramStart"/>
       <w:r>
         <w:rPr>
           <w:rFonts w:ascii="Times New Roman" w:eastAsia="Times New Roman" w:hAnsi="Times New Roman" w:cs="Times New Roman"/>
           <w:sz w:val="28"/>
         </w:rPr>
-        <w:t>.env</w:t>
-      </w:r>
-      <w:proofErr w:type="gramEnd"/>
+        <w:t>.env added to .</w:t>
+      </w:r>
+      <w:proofErr w:type="spellStart"/>
       <w:r>
         <w:rPr>
           <w:rFonts w:ascii="Times New Roman" w:eastAsia="Times New Roman" w:hAnsi="Times New Roman" w:cs="Times New Roman"/>
           <w:sz w:val="28"/>
         </w:rPr>
-        <w:t xml:space="preserve"> added </w:t>
-      </w:r>
-      <w:proofErr w:type="gramStart"/>
-      <w:r>
-        <w:rPr>
-          <w:rFonts w:ascii="Times New Roman" w:eastAsia="Times New Roman" w:hAnsi="Times New Roman" w:cs="Times New Roman"/>
-          <w:sz w:val="28"/>
-        </w:rPr>
-        <w:t>to .</w:t>
-      </w:r>
-      <w:proofErr w:type="spellStart"/>
-      <w:r>
-        <w:rPr>
-          <w:rFonts w:ascii="Times New Roman" w:eastAsia="Times New Roman" w:hAnsi="Times New Roman" w:cs="Times New Roman"/>
-          <w:sz w:val="28"/>
-        </w:rPr>
         <w:t>gitignore</w:t>
       </w:r>
       <w:proofErr w:type="spellEnd"/>
-      <w:proofErr w:type="gramEnd"/>
       <w:r>
         <w:rPr>
           <w:rFonts w:ascii="Times New Roman" w:eastAsia="Times New Roman" w:hAnsi="Times New Roman" w:cs="Times New Roman"/>
@@ -16880,7 +16781,7 @@
               </wp:inline>
             </w:drawing>
           </mc:Choice>
-          <mc:Fallback xmlns:a="http://schemas.openxmlformats.org/drawingml/2006/main" xmlns:w16cei="http://schemas.microsoft.com/office/word/2026/wordml/cei">
+          <mc:Fallback xmlns:w16cei="http://schemas.microsoft.com/office/word/2026/wordml/cei" xmlns:a="http://schemas.openxmlformats.org/drawingml/2006/main">
             <w:pict>
               <v:group id="Group 31019" style="width:468.1pt;height:1.49005pt;mso-position-horizontal-relative:char;mso-position-vertical-relative:line" coordsize="59448,189">
                 <v:shape id="Shape 40998" style="position:absolute;width:59436;height:184;left:0;top:0;" coordsize="5943600,18415" path="m0,0l5943600,0l5943600,18415l0,18415l0,0">
@@ -18830,15 +18731,7 @@
         <w:ind w:left="-5"/>
       </w:pPr>
       <w:r>
-        <w:t xml:space="preserve">13.1 </w:t>
-      </w:r>
-      <w:proofErr w:type="gramStart"/>
-      <w:r>
-        <w:t>Non-functional</w:t>
-      </w:r>
-      <w:proofErr w:type="gramEnd"/>
-      <w:r>
-        <w:t xml:space="preserve"> requirements </w:t>
+        <w:t xml:space="preserve">13.1 Non-functional requirements </w:t>
       </w:r>
     </w:p>
     <w:tbl>
@@ -19682,14 +19575,7 @@
                 <w:rFonts w:ascii="Times New Roman" w:eastAsia="Times New Roman" w:hAnsi="Times New Roman" w:cs="Times New Roman"/>
                 <w:sz w:val="28"/>
               </w:rPr>
-              <w:t>Ananya</w:t>
-            </w:r>
-            <w:r>
-              <w:rPr>
-                <w:rFonts w:ascii="Times New Roman" w:eastAsia="Times New Roman" w:hAnsi="Times New Roman" w:cs="Times New Roman"/>
-                <w:sz w:val="28"/>
-              </w:rPr>
-              <w:t xml:space="preserve"> </w:t>
+              <w:t xml:space="preserve">Ananya </w:t>
             </w:r>
           </w:p>
         </w:tc>
@@ -19823,14 +19709,7 @@
                 <w:rFonts w:ascii="Times New Roman" w:eastAsia="Times New Roman" w:hAnsi="Times New Roman" w:cs="Times New Roman"/>
                 <w:sz w:val="28"/>
               </w:rPr>
-              <w:t>Palak</w:t>
-            </w:r>
-            <w:r>
-              <w:rPr>
-                <w:rFonts w:ascii="Times New Roman" w:eastAsia="Times New Roman" w:hAnsi="Times New Roman" w:cs="Times New Roman"/>
-                <w:sz w:val="28"/>
-              </w:rPr>
-              <w:t xml:space="preserve"> </w:t>
+              <w:t xml:space="preserve">Palak </w:t>
             </w:r>
           </w:p>
         </w:tc>
@@ -20471,7 +20350,7 @@
               </wp:inline>
             </w:drawing>
           </mc:Choice>
-          <mc:Fallback xmlns:a="http://schemas.openxmlformats.org/drawingml/2006/main" xmlns:w16cei="http://schemas.microsoft.com/office/word/2026/wordml/cei">
+          <mc:Fallback xmlns:w16cei="http://schemas.microsoft.com/office/word/2026/wordml/cei" xmlns:a="http://schemas.openxmlformats.org/drawingml/2006/main">
             <w:pict>
               <v:group id="Group 35799" style="width:468.1pt;height:1.48999pt;mso-position-horizontal-relative:char;mso-position-vertical-relative:line" coordsize="59448,189">
                 <v:shape id="Shape 41034" style="position:absolute;width:59436;height:177;left:0;top:0;" coordsize="5943600,17780" path="m0,0l5943600,0l5943600,17780l0,17780l0,0">
@@ -21807,7 +21686,7 @@
               </wp:inline>
             </w:drawing>
           </mc:Choice>
-          <mc:Fallback xmlns:a="http://schemas.openxmlformats.org/drawingml/2006/main" xmlns:w16cei="http://schemas.microsoft.com/office/word/2026/wordml/cei">
+          <mc:Fallback xmlns:w16cei="http://schemas.microsoft.com/office/word/2026/wordml/cei" xmlns:a="http://schemas.openxmlformats.org/drawingml/2006/main">
             <w:pict>
               <v:group id="Group 34991" style="width:468.1pt;height:1.51001pt;mso-position-horizontal-relative:char;mso-position-vertical-relative:line" coordsize="59448,191">
                 <v:shape id="Shape 41052" style="position:absolute;width:59436;height:184;left:0;top:0;" coordsize="5943600,18415" path="m0,0l5943600,0l5943600,18415l0,18415l0,0">
@@ -22197,23 +22076,7 @@
                 <w:rFonts w:ascii="Times New Roman" w:eastAsia="Times New Roman" w:hAnsi="Times New Roman" w:cs="Times New Roman"/>
                 <w:sz w:val="28"/>
               </w:rPr>
-              <w:t xml:space="preserve">Tech </w:t>
-            </w:r>
-            <w:proofErr w:type="gramStart"/>
-            <w:r>
-              <w:rPr>
-                <w:rFonts w:ascii="Times New Roman" w:eastAsia="Times New Roman" w:hAnsi="Times New Roman" w:cs="Times New Roman"/>
-                <w:sz w:val="28"/>
-              </w:rPr>
-              <w:t>Lead</w:t>
-            </w:r>
-            <w:proofErr w:type="gramEnd"/>
-            <w:r>
-              <w:rPr>
-                <w:rFonts w:ascii="Times New Roman" w:eastAsia="Times New Roman" w:hAnsi="Times New Roman" w:cs="Times New Roman"/>
-                <w:sz w:val="28"/>
-              </w:rPr>
-              <w:t xml:space="preserve"> </w:t>
+              <w:t xml:space="preserve">Tech Lead </w:t>
             </w:r>
           </w:p>
         </w:tc>
@@ -22304,23 +22167,7 @@
                 <w:rFonts w:ascii="Times New Roman" w:eastAsia="Times New Roman" w:hAnsi="Times New Roman" w:cs="Times New Roman"/>
                 <w:sz w:val="28"/>
               </w:rPr>
-              <w:t xml:space="preserve">Tech </w:t>
-            </w:r>
-            <w:proofErr w:type="gramStart"/>
-            <w:r>
-              <w:rPr>
-                <w:rFonts w:ascii="Times New Roman" w:eastAsia="Times New Roman" w:hAnsi="Times New Roman" w:cs="Times New Roman"/>
-                <w:sz w:val="28"/>
-              </w:rPr>
-              <w:t>Lead</w:t>
-            </w:r>
-            <w:proofErr w:type="gramEnd"/>
-            <w:r>
-              <w:rPr>
-                <w:rFonts w:ascii="Times New Roman" w:eastAsia="Times New Roman" w:hAnsi="Times New Roman" w:cs="Times New Roman"/>
-                <w:sz w:val="28"/>
-              </w:rPr>
-              <w:t xml:space="preserve"> </w:t>
+              <w:t xml:space="preserve">Tech Lead </w:t>
             </w:r>
           </w:p>
         </w:tc>
@@ -22993,7 +22840,7 @@
               </wp:inline>
             </w:drawing>
           </mc:Choice>
-          <mc:Fallback xmlns:a="http://schemas.openxmlformats.org/drawingml/2006/main" xmlns:w16cei="http://schemas.microsoft.com/office/word/2026/wordml/cei">
+          <mc:Fallback xmlns:w16cei="http://schemas.microsoft.com/office/word/2026/wordml/cei" xmlns:a="http://schemas.openxmlformats.org/drawingml/2006/main">
             <w:pict>
               <v:group id="Group 37948" style="width:468.1pt;height:1.48001pt;mso-position-horizontal-relative:char;mso-position-vertical-relative:line" coordsize="59448,187">
                 <v:shape id="Shape 41070" style="position:absolute;width:59436;height:184;left:0;top:0;" coordsize="5943600,18415" path="m0,0l5943600,0l5943600,18415l0,18415l0,0">
@@ -23410,14 +23257,7 @@
                 <w:rFonts w:ascii="Times New Roman" w:eastAsia="Times New Roman" w:hAnsi="Times New Roman" w:cs="Times New Roman"/>
                 <w:sz w:val="28"/>
               </w:rPr>
-              <w:t xml:space="preserve">Prakhar Kulshreshtha </w:t>
-            </w:r>
-            <w:r>
-              <w:rPr>
-                <w:rFonts w:ascii="Times New Roman" w:eastAsia="Times New Roman" w:hAnsi="Times New Roman" w:cs="Times New Roman"/>
-                <w:sz w:val="28"/>
-              </w:rPr>
-              <w:t xml:space="preserve"> </w:t>
+              <w:t xml:space="preserve">Prakhar Kulshreshtha  </w:t>
             </w:r>
           </w:p>
         </w:tc>
@@ -24313,7 +24153,7 @@
               </wp:inline>
             </w:drawing>
           </mc:Choice>
-          <mc:Fallback xmlns:a="http://schemas.openxmlformats.org/drawingml/2006/main" xmlns:w16cei="http://schemas.microsoft.com/office/word/2026/wordml/cei">
+          <mc:Fallback xmlns:w16cei="http://schemas.microsoft.com/office/word/2026/wordml/cei" xmlns:a="http://schemas.openxmlformats.org/drawingml/2006/main">
             <w:pict>
               <v:group id="Group 37949" style="width:468.1pt;height:1.53003pt;mso-position-horizontal-relative:char;mso-position-vertical-relative:line" coordsize="59448,194">
                 <v:shape id="Shape 41088" style="position:absolute;width:59436;height:184;left:0;top:0;" coordsize="5943600,18415" path="m0,0l5943600,0l5943600,18415l0,18415l0,0">
@@ -24504,30 +24344,14 @@
           <w:rFonts w:ascii="Times New Roman" w:eastAsia="Times New Roman" w:hAnsi="Times New Roman" w:cs="Times New Roman"/>
           <w:sz w:val="28"/>
         </w:rPr>
-        <w:t xml:space="preserve"> was selected because it is the only framework that models the pipeline as an explicit, inspectable graph rather than hiding routing behind framework abstractions — a critical requirement for a project where viva evaluators will ask exactly how data flows between </w:t>
-      </w:r>
-      <w:proofErr w:type="gramStart"/>
+        <w:t xml:space="preserve"> was selected because it is the only framework that models the pipeline as an explicit, inspectable graph rather than hiding routing behind framework abstractions — a critical requirement for a project where viva evaluators will ask exactly how data flows between agents.</w:t>
+      </w:r>
       <w:r>
         <w:rPr>
           <w:rFonts w:ascii="Times New Roman" w:eastAsia="Times New Roman" w:hAnsi="Times New Roman" w:cs="Times New Roman"/>
           <w:sz w:val="28"/>
         </w:rPr>
-        <w:t>agents.</w:t>
-      </w:r>
-      <w:r>
-        <w:rPr>
-          <w:rFonts w:ascii="Times New Roman" w:eastAsia="Times New Roman" w:hAnsi="Times New Roman" w:cs="Times New Roman"/>
-          <w:sz w:val="28"/>
-        </w:rPr>
-        <w:t>.</w:t>
-      </w:r>
-      <w:proofErr w:type="gramEnd"/>
-      <w:r>
-        <w:rPr>
-          <w:rFonts w:ascii="Times New Roman" w:eastAsia="Times New Roman" w:hAnsi="Times New Roman" w:cs="Times New Roman"/>
-          <w:sz w:val="28"/>
-        </w:rPr>
-        <w:t xml:space="preserve"> </w:t>
+        <w:t xml:space="preserve">. </w:t>
       </w:r>
     </w:p>
     <w:p>
@@ -24646,37 +24470,21 @@
           <w:rFonts w:ascii="Times New Roman" w:eastAsia="Times New Roman" w:hAnsi="Times New Roman" w:cs="Times New Roman"/>
           <w:sz w:val="28"/>
         </w:rPr>
-        <w:t xml:space="preserve">Peer review from classmates and faculty mentor will be used to assess clarity of the decision </w:t>
-      </w:r>
-      <w:proofErr w:type="gramStart"/>
+        <w:t>Peer review from classmates and faculty mentor will be used to assess clarity of the decision explanations</w:t>
+      </w:r>
       <w:r>
         <w:rPr>
           <w:rFonts w:ascii="Times New Roman" w:eastAsia="Times New Roman" w:hAnsi="Times New Roman" w:cs="Times New Roman"/>
           <w:sz w:val="28"/>
         </w:rPr>
-        <w:t>explanations</w:t>
+        <w:t xml:space="preserve"> </w:t>
       </w:r>
       <w:r>
         <w:rPr>
           <w:rFonts w:ascii="Times New Roman" w:eastAsia="Times New Roman" w:hAnsi="Times New Roman" w:cs="Times New Roman"/>
           <w:sz w:val="28"/>
         </w:rPr>
-        <w:t xml:space="preserve"> </w:t>
-      </w:r>
-      <w:r>
-        <w:rPr>
-          <w:rFonts w:ascii="Times New Roman" w:eastAsia="Times New Roman" w:hAnsi="Times New Roman" w:cs="Times New Roman"/>
-          <w:sz w:val="28"/>
-        </w:rPr>
-        <w:t> and</w:t>
-      </w:r>
-      <w:proofErr w:type="gramEnd"/>
-      <w:r>
-        <w:rPr>
-          <w:rFonts w:ascii="Times New Roman" w:eastAsia="Times New Roman" w:hAnsi="Times New Roman" w:cs="Times New Roman"/>
-          <w:sz w:val="28"/>
-        </w:rPr>
-        <w:t xml:space="preserve"> usability of the dashboard</w:t>
+        <w:t> and usability of the dashboard</w:t>
       </w:r>
     </w:p>
     <w:p>
@@ -25250,7 +25058,7 @@
               </wp:inline>
             </w:drawing>
           </mc:Choice>
-          <mc:Fallback xmlns:a="http://schemas.openxmlformats.org/drawingml/2006/main" xmlns:w16cei="http://schemas.microsoft.com/office/word/2026/wordml/cei">
+          <mc:Fallback xmlns:w16cei="http://schemas.microsoft.com/office/word/2026/wordml/cei" xmlns:a="http://schemas.openxmlformats.org/drawingml/2006/main">
             <w:pict>
               <v:group id="Group 33817" style="width:468.1pt;height:1.54999pt;mso-position-horizontal-relative:char;mso-position-vertical-relative:line" coordsize="59448,196">
                 <v:shape id="Shape 41106" style="position:absolute;width:59436;height:184;left:0;top:0;" coordsize="5943600,18415" path="m0,0l5943600,0l5943600,18415l0,18415l0,0">
@@ -25823,16 +25631,15 @@
           <w:sz w:val="28"/>
           <w:szCs w:val="28"/>
         </w:rPr>
-        <w:t xml:space="preserve"> “Multi-Agent Systems for Decision Support” </w:t>
-      </w:r>
-      <w:proofErr w:type="gramStart"/>
+        <w:t xml:space="preserve"> “Multi-Agent Systems for Decision Support” – </w:t>
+      </w:r>
       <w:r>
         <w:rPr>
           <w:color w:val="1F2937"/>
           <w:sz w:val="28"/>
           <w:szCs w:val="28"/>
         </w:rPr>
-        <w:t xml:space="preserve">– </w:t>
+        <w:t xml:space="preserve"> </w:t>
       </w:r>
       <w:r>
         <w:rPr>
@@ -25840,17 +25647,8 @@
           <w:sz w:val="28"/>
           <w:szCs w:val="28"/>
         </w:rPr>
-        <w:t xml:space="preserve"> </w:t>
-      </w:r>
-      <w:r>
-        <w:rPr>
-          <w:color w:val="1F2937"/>
-          <w:sz w:val="28"/>
-          <w:szCs w:val="28"/>
-        </w:rPr>
         <w:t>https://ieeexplore.ieee.org</w:t>
       </w:r>
-      <w:proofErr w:type="gramEnd"/>
     </w:p>
     <w:p>
       <w:pPr>
@@ -31134,6 +30932,7 @@
   <w:style w:type="character" w:default="1" w:styleId="DefaultParagraphFont">
     <w:name w:val="Default Paragraph Font"/>
     <w:uiPriority w:val="1"/>
+    <w:semiHidden/>
     <w:unhideWhenUsed/>
   </w:style>
   <w:style w:type="table" w:default="1" w:styleId="TableNormal">

</xml_diff>